<commit_message>
Another round of changes
This should be the new update.
</commit_message>
<xml_diff>
--- a/Publishing-the-Archive-on-GitHub.docx
+++ b/Publishing-the-Archive-on-GitHub.docx
@@ -190,7 +190,7 @@
       <w:r>
         <w:t xml:space="preserve">Go to </w:t>
       </w:r>
-      <w:hyperlink w:history="1" r:id="rIdg4-hirelsvtcpud2nakdp">
+      <w:hyperlink w:history="1" r:id="rIdphunh87cdvul5lt8bmuac">
         <w:r>
           <w:rPr>
             <w:rStyle w:val="Hyperlink"/>
@@ -323,7 +323,7 @@
       <w:r>
         <w:t xml:space="preserve">Download GitHub Desktop from </w:t>
       </w:r>
-      <w:hyperlink w:history="1" r:id="rId8ogeu4zrshy9rfl1h-lyo">
+      <w:hyperlink w:history="1" r:id="rIdcm5pc3nsrhj5iqkessn7c">
         <w:r>
           <w:rPr>
             <w:rStyle w:val="Hyperlink"/>
@@ -459,7 +459,7 @@
         <w:t xml:space="preserve">psiu-archives</w:t>
       </w:r>
       <w:r>
-        <w:t xml:space="preserve">; for the description put something like "The Psi Upsilon Digital Archives — 460 scanned volumes, searchable"; leave </w:t>
+        <w:t xml:space="preserve">; for the description put something like "The Psi Upsilon Digital Museum — 460 scanned volumes, searchable"; leave </w:t>
       </w:r>
       <w:r>
         <w:rPr>
@@ -520,7 +520,7 @@
           <w:sz w:val="19"/>
           <w:szCs w:val="19"/>
         </w:rPr>
-        <w:t xml:space="preserve">The Psi Upsilon Digital Archives</w:t>
+        <w:t xml:space="preserve">The Psi Upsilon Digital Museum</w:t>
       </w:r>
       <w:r>
         <w:t xml:space="preserve">, then click </w:t>
@@ -1325,7 +1325,7 @@
           <w:sz w:val="18"/>
           <w:szCs w:val="18"/>
         </w:rPr>
-        <w:t xml:space="preserve">git commit -m "The Psi Upsilon Digital Archives"</w:t>
+        <w:t xml:space="preserve">git commit -m "The Psi Upsilon Digital Museum"</w:t>
       </w:r>
     </w:p>
     <w:p>
@@ -1411,7 +1411,7 @@
       <w:r>
         <w:t xml:space="preserve">Make a free account at </w:t>
       </w:r>
-      <w:hyperlink w:history="1" r:id="rIdmlx82iu-0klkdg-dfqfgd">
+      <w:hyperlink w:history="1" r:id="rIdfuwvx1uc84ly2hmt3s6rg">
         <w:r>
           <w:rPr>
             <w:rStyle w:val="Hyperlink"/>
@@ -2557,7 +2557,7 @@
           <w:sz w:val="16"/>
           <w:szCs w:val="16"/>
         </w:rPr>
-        <w:t xml:space="preserve">Psi Upsilon Digital Archives · August 2026</w:t>
+        <w:t xml:space="preserve">Psi Upsilon Digital Museum · August 2026</w:t>
       </w:r>
     </w:p>
     <w:sectPr>

</xml_diff>